<commit_message>
Protocole VIV-0010 : règlement MVola au 28 août et acceptation par courriel
Fixe les modalités arrêtées par la direction. Le règlement s'effectue par
MVola au plus tard le vendredi 28 août, sous condition d'acceptation à cette
même date ; à défaut le protocole est réputé caduc, de sorte que l'offre ne
subsiste pas comme pollicitation ouverte.

Écarte l'émission de facture, le protocole et le justificatif de transaction
tenant lieu de pièce justificative pour les deux Parties — ce qui supprime
au passage la dépendance du paiement à une démarche de la Prestataire.

Ajoute un article consacré à l'acceptation par courriel : mention d'accord
convenue, valeur de signature conférée d'un commun accord, date de réception
valant Date d'effet, régularisation manuscrite ultérieure sans incidence sur
la validité.

Co-Authored-By: Claude Opus 5 <noreply@anthropic.com>
Claude-Session: https://claude.ai/code/session_01WUqDpAtfARoTCDbjN9neCH
</commit_message>
<xml_diff>
--- a/07-Recrutement-Vivier/PROTOCOLE-RESILIATION-AMIABLE-VIV0010.docx
+++ b/07-Recrutement-Vivier/PROTOCOLE-RESILIATION-AMIABLE-VIV0010.docx
@@ -387,25 +387,105 @@
           <w:sz w:val="21"/>
           <w:szCs w:val="21"/>
         </w:rPr>
-        <w:t xml:space="preserve">Ce règlement interviendra sur émission de la facture de la Prestataire, dans les conditions prévues à l'article 5.2 du Contrat. </w:t>
-      </w:r>
-      <w:r>
-        <w:rPr>
-          <w:rFonts w:ascii="Calibri" w:cs="Calibri" w:eastAsia="Calibri" w:hAnsi="Calibri"/>
-          <w:b/>
-          <w:bCs/>
-          <w:sz w:val="21"/>
-          <w:szCs w:val="21"/>
-        </w:rPr>
-        <w:t xml:space="preserve">À défaut d'émission de cette facture dans les quinze (15) jours suivant la signature du présent protocole</w:t>
-      </w:r>
-      <w:r>
-        <w:rPr>
-          <w:rFonts w:ascii="Calibri" w:cs="Calibri" w:eastAsia="Calibri" w:hAnsi="Calibri"/>
-          <w:sz w:val="21"/>
-          <w:szCs w:val="21"/>
-        </w:rPr>
-        <w:t xml:space="preserve">, la Société pourra procéder au règlement sur simple ordre de virement, aux dernières coordonnées de paiement communiquées par la Prestataire, ce paiement produisant alors les mêmes effets libératoires que s'il avait été précédé d'une facture.</w:t>
+        <w:t xml:space="preserve">Ce règlement sera effectué </w:t>
+      </w:r>
+      <w:r>
+        <w:rPr>
+          <w:rFonts w:ascii="Calibri" w:cs="Calibri" w:eastAsia="Calibri" w:hAnsi="Calibri"/>
+          <w:b/>
+          <w:bCs/>
+          <w:sz w:val="21"/>
+          <w:szCs w:val="21"/>
+        </w:rPr>
+        <w:t xml:space="preserve">par MVola</w:t>
+      </w:r>
+      <w:r>
+        <w:rPr>
+          <w:rFonts w:ascii="Calibri" w:cs="Calibri" w:eastAsia="Calibri" w:hAnsi="Calibri"/>
+          <w:sz w:val="21"/>
+          <w:szCs w:val="21"/>
+        </w:rPr>
+        <w:t xml:space="preserve">, au numéro de compte communiqué par la Prestataire, conformément à l'article 5.3 du Contrat qui admet ce moyen de paiement, </w:t>
+      </w:r>
+      <w:r>
+        <w:rPr>
+          <w:rFonts w:ascii="Calibri" w:cs="Calibri" w:eastAsia="Calibri" w:hAnsi="Calibri"/>
+          <w:b/>
+          <w:bCs/>
+          <w:sz w:val="21"/>
+          <w:szCs w:val="21"/>
+        </w:rPr>
+        <w:t xml:space="preserve">au plus tard le vendredi 28 août 2026</w:t>
+      </w:r>
+      <w:r>
+        <w:rPr>
+          <w:rFonts w:ascii="Calibri" w:cs="Calibri" w:eastAsia="Calibri" w:hAnsi="Calibri"/>
+          <w:sz w:val="21"/>
+          <w:szCs w:val="21"/>
+        </w:rPr>
+        <w:t xml:space="preserve">, sous réserve que le présent protocole ait été accepté par la Prestataire au plus tard à cette même date dans les formes prévues à l'article 10.</w:t>
+      </w:r>
+    </w:p>
+    <w:p>
+      <w:pPr>
+        <w:spacing w:after="130"/>
+      </w:pPr>
+      <w:r>
+        <w:rPr>
+          <w:rFonts w:ascii="Calibri" w:cs="Calibri" w:eastAsia="Calibri" w:hAnsi="Calibri"/>
+          <w:sz w:val="21"/>
+          <w:szCs w:val="21"/>
+        </w:rPr>
+        <w:t xml:space="preserve">À défaut d'acceptation dans ce délai, le présent protocole sera </w:t>
+      </w:r>
+      <w:r>
+        <w:rPr>
+          <w:rFonts w:ascii="Calibri" w:cs="Calibri" w:eastAsia="Calibri" w:hAnsi="Calibri"/>
+          <w:b/>
+          <w:bCs/>
+          <w:sz w:val="21"/>
+          <w:szCs w:val="21"/>
+        </w:rPr>
+        <w:t xml:space="preserve">réputé caduc</w:t>
+      </w:r>
+      <w:r>
+        <w:rPr>
+          <w:rFonts w:ascii="Calibri" w:cs="Calibri" w:eastAsia="Calibri" w:hAnsi="Calibri"/>
+          <w:sz w:val="21"/>
+          <w:szCs w:val="21"/>
+        </w:rPr>
+        <w:t xml:space="preserve"> et ne produira aucun effet, sans qu'il soit besoin d'aucune formalité.</w:t>
+      </w:r>
+    </w:p>
+    <w:p>
+      <w:pPr>
+        <w:spacing w:after="130"/>
+      </w:pPr>
+      <w:r>
+        <w:rPr>
+          <w:rFonts w:ascii="Calibri" w:cs="Calibri" w:eastAsia="Calibri" w:hAnsi="Calibri"/>
+          <w:sz w:val="21"/>
+          <w:szCs w:val="21"/>
+        </w:rPr>
+        <w:t xml:space="preserve">Les Parties conviennent expressément </w:t>
+      </w:r>
+      <w:r>
+        <w:rPr>
+          <w:rFonts w:ascii="Calibri" w:cs="Calibri" w:eastAsia="Calibri" w:hAnsi="Calibri"/>
+          <w:b/>
+          <w:bCs/>
+          <w:sz w:val="21"/>
+          <w:szCs w:val="21"/>
+        </w:rPr>
+        <w:t xml:space="preserve">qu'aucune facture ne sera émise</w:t>
+      </w:r>
+      <w:r>
+        <w:rPr>
+          <w:rFonts w:ascii="Calibri" w:cs="Calibri" w:eastAsia="Calibri" w:hAnsi="Calibri"/>
+          <w:sz w:val="21"/>
+          <w:szCs w:val="21"/>
+        </w:rPr>
+        <w:t xml:space="preserve"> au titre de ce règlement, le présent protocole et le justificatif de transaction MVola tenant lieu de pièce justificative du paiement pour l'une et l'autre des Parties.</w:t>
       </w:r>
     </w:p>
     <w:p>
@@ -1242,7 +1322,115 @@
           <w:sz w:val="23"/>
           <w:szCs w:val="23"/>
         </w:rPr>
-        <w:t xml:space="preserve">Article 10 — Dispositions finales</w:t>
+        <w:t xml:space="preserve">Article 10 — Acceptation et signature électronique</w:t>
+      </w:r>
+    </w:p>
+    <w:p>
+      <w:pPr>
+        <w:spacing w:after="130"/>
+      </w:pPr>
+      <w:r>
+        <w:rPr>
+          <w:rFonts w:ascii="Calibri" w:cs="Calibri" w:eastAsia="Calibri" w:hAnsi="Calibri"/>
+          <w:sz w:val="21"/>
+          <w:szCs w:val="21"/>
+        </w:rPr>
+        <w:t xml:space="preserve">Les Parties conviennent que le présent protocole pourra être valablement accepté par la Prestataire </w:t>
+      </w:r>
+      <w:r>
+        <w:rPr>
+          <w:rFonts w:ascii="Calibri" w:cs="Calibri" w:eastAsia="Calibri" w:hAnsi="Calibri"/>
+          <w:b/>
+          <w:bCs/>
+          <w:sz w:val="21"/>
+          <w:szCs w:val="21"/>
+        </w:rPr>
+        <w:t xml:space="preserve">au moyen d'un courriel de réponse</w:t>
+      </w:r>
+      <w:r>
+        <w:rPr>
+          <w:rFonts w:ascii="Calibri" w:cs="Calibri" w:eastAsia="Calibri" w:hAnsi="Calibri"/>
+          <w:sz w:val="21"/>
+          <w:szCs w:val="21"/>
+        </w:rPr>
+        <w:t xml:space="preserve"> adressé depuis son adresse électronique randrianasinoro@gmail.com et comportant la mention suivante :</w:t>
+      </w:r>
+    </w:p>
+    <w:p>
+      <w:pPr>
+        <w:spacing w:after="130" w:before="60"/>
+        <w:ind w:left="420"/>
+      </w:pPr>
+      <w:r>
+        <w:rPr>
+          <w:rFonts w:ascii="Calibri" w:cs="Calibri" w:eastAsia="Calibri" w:hAnsi="Calibri"/>
+          <w:b/>
+          <w:bCs/>
+          <w:i/>
+          <w:iCs/>
+          <w:sz w:val="21"/>
+          <w:szCs w:val="21"/>
+        </w:rPr>
+        <w:t xml:space="preserve">« Lu et approuvé, bon pour accord sur le protocole de résiliation amiable du contrat du 30 juin 2026. »</w:t>
+      </w:r>
+    </w:p>
+    <w:p>
+      <w:pPr>
+        <w:spacing w:after="130"/>
+      </w:pPr>
+      <w:r>
+        <w:rPr>
+          <w:rFonts w:ascii="Calibri" w:cs="Calibri" w:eastAsia="Calibri" w:hAnsi="Calibri"/>
+          <w:sz w:val="21"/>
+          <w:szCs w:val="21"/>
+        </w:rPr>
+        <w:t xml:space="preserve">Les Parties conviennent expressément de </w:t>
+      </w:r>
+      <w:r>
+        <w:rPr>
+          <w:rFonts w:ascii="Calibri" w:cs="Calibri" w:eastAsia="Calibri" w:hAnsi="Calibri"/>
+          <w:b/>
+          <w:bCs/>
+          <w:sz w:val="21"/>
+          <w:szCs w:val="21"/>
+        </w:rPr>
+        <w:t xml:space="preserve">conférer à ce courriel la valeur d'une signature</w:t>
+      </w:r>
+      <w:r>
+        <w:rPr>
+          <w:rFonts w:ascii="Calibri" w:cs="Calibri" w:eastAsia="Calibri" w:hAnsi="Calibri"/>
+          <w:sz w:val="21"/>
+          <w:szCs w:val="21"/>
+        </w:rPr>
+        <w:t xml:space="preserve">, engageant la Prestataire au même titre qu'une signature manuscrite apposée au bas des présentes. La date de réception de ce courriel par la Société constitue la date de signature et la Date d'effet au sens de l'article 2.</w:t>
+      </w:r>
+    </w:p>
+    <w:p>
+      <w:pPr>
+        <w:spacing w:after="130"/>
+      </w:pPr>
+      <w:r>
+        <w:rPr>
+          <w:rFonts w:ascii="Calibri" w:cs="Calibri" w:eastAsia="Calibri" w:hAnsi="Calibri"/>
+          <w:sz w:val="21"/>
+          <w:szCs w:val="21"/>
+        </w:rPr>
+        <w:t xml:space="preserve">La signature manuscrite des exemplaires papier pourra être régularisée ultérieurement, sans que cette régularisation conditionne la validité, la prise d'effet ou l'exécution du présent protocole.</w:t>
+      </w:r>
+    </w:p>
+    <w:p>
+      <w:pPr>
+        <w:spacing w:after="120" w:before="250"/>
+      </w:pPr>
+      <w:r>
+        <w:rPr>
+          <w:rFonts w:ascii="Calibri" w:cs="Calibri" w:eastAsia="Calibri" w:hAnsi="Calibri"/>
+          <w:b/>
+          <w:bCs/>
+          <w:sz w:val="23"/>
+          <w:szCs w:val="23"/>
+        </w:rPr>
+        <w:t xml:space="preserve">Article 11 — Dispositions finales</w:t>
       </w:r>
     </w:p>
     <w:p>

</xml_diff>